<commit_message>
docs: rename repository and remove client-specific WCQ references from documentation
</commit_message>
<xml_diff>
--- a/exports/SailPoint_GitOps_CICD_Architecture.docx
+++ b/exports/SailPoint_GitOps_CICD_Architecture.docx
@@ -280,7 +280,7 @@
     </w:p>
     <w:p>
       <w:r>
-        <w:t>The holistic end-to-end integration mapping between developers, GitHub Actions approval gates, compile scripts, and target tenants is illustrated below:</w:t>
+        <w:t>The end-to-end integration mapping between developers, GitHub Actions runners, AWS Secrets Manager, and SailPoint is illustrated below:</w:t>
       </w:r>
     </w:p>
     <w:p>
@@ -334,11 +334,6 @@
     <w:p>
       <w:r>
         <w:br w:type="page"/>
-      </w:r>
-    </w:p>
-    <w:p>
-      <w:r>
-        <w:t>The detail block flowchart showing the data transmission from AWS Secrets Manager to target tenants:</w:t>
       </w:r>
     </w:p>
     <w:p>
@@ -672,6 +667,93 @@
     </w:p>
     <w:p>
       <w:pPr>
+        <w:pStyle w:val="Heading2"/>
+      </w:pPr>
+      <w:r>
+        <w:t>4.3 validate.yml: Pull Request Validation &amp; Linting Gates</w:t>
+      </w:r>
+    </w:p>
+    <w:p>
+      <w:r>
+        <w:t>To prevent malformed configurations from ever being deployed to target tenants, a pull request validation workflow is executed automatically on every opened Pull Request targeting the dev, uat, or main branches:</w:t>
+      </w:r>
+    </w:p>
+    <w:tbl>
+      <w:tblPr>
+        <w:tblW w:type="auto" w:w="0"/>
+        <w:tblLayout w:type="fixed"/>
+        <w:tblLook w:firstColumn="1" w:firstRow="1" w:lastColumn="0" w:lastRow="0" w:noHBand="0" w:noVBand="1" w:val="04A0"/>
+      </w:tblPr>
+      <w:tblGrid>
+        <w:gridCol w:w="9360"/>
+      </w:tblGrid>
+      <w:tr>
+        <w:tc>
+          <w:tcPr>
+            <w:tcW w:type="dxa" w:w="8640"/>
+            <w:shd w:val="clear" w:color="auto" w:fill="F5F5F5"/>
+          </w:tcPr>
+          <w:p>
+            <w:pPr>
+              <w:spacing w:before="80" w:after="80"/>
+              <w:ind w:left="144" w:right="144"/>
+            </w:pPr>
+            <w:r>
+              <w:rPr>
+                <w:rFonts w:ascii="Consolas" w:hAnsi="Consolas"/>
+                <w:color w:val="333333"/>
+                <w:sz w:val="19"/>
+              </w:rPr>
+              <w:t>on:</w:t>
+              <w:br/>
+              <w:t xml:space="preserve">  pull_request:</w:t>
+              <w:br/>
+              <w:t xml:space="preserve">    branches:</w:t>
+              <w:br/>
+              <w:t xml:space="preserve">      - dev</w:t>
+              <w:br/>
+              <w:t xml:space="preserve">      - uat</w:t>
+              <w:br/>
+              <w:t xml:space="preserve">      - main</w:t>
+              <w:br/>
+              <w:br/>
+              <w:t>jobs:</w:t>
+              <w:br/>
+              <w:t xml:space="preserve">  validate:</w:t>
+              <w:br/>
+              <w:t xml:space="preserve">    runs-on: ubuntu-latest</w:t>
+              <w:br/>
+              <w:t xml:space="preserve">    steps:</w:t>
+              <w:br/>
+              <w:t xml:space="preserve">      - name: Checkout Code</w:t>
+              <w:br/>
+              <w:t xml:space="preserve">        uses: actions/checkout@v4</w:t>
+              <w:br/>
+              <w:br/>
+              <w:t xml:space="preserve">      - name: Run Syntax Validator</w:t>
+              <w:br/>
+              <w:t xml:space="preserve">        run: |</w:t>
+              <w:br/>
+              <w:t xml:space="preserve">          chmod +x scripts/validate.sh</w:t>
+              <w:br/>
+              <w:t xml:space="preserve">          ./scripts/validate.sh</w:t>
+            </w:r>
+          </w:p>
+        </w:tc>
+      </w:tr>
+    </w:tbl>
+    <w:p/>
+    <w:p>
+      <w:r>
+        <w:t>Technical DevOps Analysis:</w:t>
+        <w:br/>
+        <w:t>- The workflow runs on the GitHub-hosted public runner with no access keys or tenant client secrets. This keeps the PR stage entirely isolated and secure.</w:t>
+        <w:br/>
+        <w:t>- If a developer commits a JSON file with invalid formatting (e.g., missing quotes, duplicate keys, trailing commas), the linter fails and blocks the PR from merging.</w:t>
+      </w:r>
+    </w:p>
+    <w:p>
+      <w:pPr>
         <w:pStyle w:val="Heading1"/>
       </w:pPr>
       <w:r>
@@ -789,7 +871,7 @@
         <w:br/>
         <w:t>1. Clone the repository locally:</w:t>
         <w:br/>
-        <w:t xml:space="preserve">   git clone https://github.com/Yash-Thales/WCQ_SailPoint_ISC_CI-CD_SailPoint_CLI_AWS.git</w:t>
+        <w:t xml:space="preserve">   git clone https://github.com/Yash-Thales/SailPoint_ISC_CI-CD_SailPoint_CLI_AWS.git</w:t>
         <w:br/>
         <w:t>2. Add your AWS IAM credentials ('AWS_ACCESS_KEY_ID' and 'AWS_SECRET_ACCESS_KEY') to your GitHub Repository Secrets.</w:t>
         <w:br/>
@@ -926,12 +1008,12 @@
         <w:rPr>
           <w:color w:val="0070C0"/>
         </w:rPr>
-        <w:t>10. Strategic Operating Model Comparison: Full DevOps vs. Hybrid Model for WCQ</w:t>
+        <w:t>10. Strategic Operating Model Comparison: Full DevOps vs. Hybrid Model for the Enterprise</w:t>
       </w:r>
     </w:p>
     <w:p>
       <w:r>
-        <w:t>When planning the deployment strategy for WCQ, the team must choose between a Full DevOps Model and a Hybrid Operating Model. The comparison table below highlights the trade-offs:</w:t>
+        <w:t>When planning the deployment strategy for the Enterprise, the team must choose between a Full DevOps Model and a Hybrid Operating Model. The comparison table below highlights the trade-offs:</w:t>
       </w:r>
     </w:p>
     <w:tbl>
@@ -1175,12 +1257,12 @@
         <w:pStyle w:val="Heading2"/>
       </w:pPr>
       <w:r>
-        <w:t>Architectural Recommendation for WCQ:</w:t>
+        <w:t>Architectural Recommendation for the Enterprise:</w:t>
       </w:r>
     </w:p>
     <w:p>
       <w:r>
-        <w:t>For WCQ, the Hybrid Operating Model is recommended. It provides immediate version control, auditing, and drift detection without introducing operational bottlenecks. Since our GitOps pipeline architecture natively supports both models, WCQ can start in the Hybrid phase and transition smoothly to Full DevOps over time with zero code changes.</w:t>
+        <w:t>For Enterprise, the Hybrid Operating Model is recommended. It provides immediate version control, auditing, and drift detection without introducing operational bottlenecks. Since our GitOps pipeline architecture natively supports both models, Enterprise can start in the Hybrid phase and transition smoothly to Full DevOps over time with zero code changes.</w:t>
       </w:r>
     </w:p>
     <w:sectPr>

</xml_diff>

<commit_message>
docs: update directory tree inside architecture guide document to match blank template state
</commit_message>
<xml_diff>
--- a/exports/SailPoint_GitOps_CICD_Architecture.docx
+++ b/exports/SailPoint_GitOps_CICD_Architecture.docx
@@ -426,7 +426,7 @@
                 <w:color w:val="333333"/>
                 <w:sz w:val="19"/>
               </w:rPr>
-              <w:t>SailPoint-ISC-GitOps-AWS/</w:t>
+              <w:t>SailPoint_ISC_CI-CD_SailPoint_CLI_AWS/</w:t>
               <w:br/>
               <w:t>├── .github/</w:t>
               <w:br/>
@@ -436,29 +436,39 @@
               <w:br/>
               <w:t>│       ├── deploy_connectors.yml # SaaS Custom connector uploader</w:t>
               <w:br/>
-              <w:t>│       └── export.yml            # Sync tenant config back to Git</w:t>
+              <w:t>│       ├── export.yml            # Sync tenant config back to Git</w:t>
+              <w:br/>
+              <w:t>│       └── validate.yml          # Pull request linting/syntax validator</w:t>
               <w:br/>
               <w:t>├── config/</w:t>
               <w:br/>
-              <w:t>│   ├── branding/</w:t>
+              <w:t>│   ├── access-profiles/          # Access profile blueprints</w:t>
               <w:br/>
-              <w:t>│   │   ├── branding-meta.json    # Branding UI configuration colors</w:t>
+              <w:t>│   ├── applications/             # Configured system integrations</w:t>
               <w:br/>
-              <w:t>│   │   └── logo.png              # UI navigation logo file</w:t>
+              <w:t>│   ├── branding/                 # Holds branding-meta.json &amp; logo.png</w:t>
               <w:br/>
-              <w:t>│   ├── sources/                  # Source connectors (e.g. AD, Workday)</w:t>
+              <w:t>│   ├── identity-profiles/        # Identity schema attributes</w:t>
               <w:br/>
-              <w:t>│   ├── transforms/               # Attribute maps and mappings</w:t>
+              <w:t>│   ├── policies/                 # Separation of Duties governance</w:t>
               <w:br/>
-              <w:t>│   └── identity-profiles/        # Identity schema profiles</w:t>
+              <w:t>│   ├── roles/                    # Role and provisioning models</w:t>
               <w:br/>
-              <w:t>├── environments/</w:t>
+              <w:t>│   ├── rules/                    # Custom target execution rules</w:t>
               <w:br/>
-              <w:t>│   ├── dev.json                  # Sandbox replacements</w:t>
+              <w:t>│   ├── sources/                  # Active Directory, Workday, etc.</w:t>
               <w:br/>
-              <w:t>│   ├── uat.json                  # Staging replacements</w:t>
+              <w:t>│   ├── transforms/               # Attribute mappings and transforms</w:t>
               <w:br/>
-              <w:t>│   └── prod.json                 # Production replacements</w:t>
+              <w:t>│   └── workflows/                # Dynamic orchestration flows</w:t>
+              <w:br/>
+              <w:t>├── connectors/                   # Custom SaaS connector packages</w:t>
+              <w:br/>
+              <w:t>├── dr-snapshots/                 # Disaster recovery snapshots</w:t>
+              <w:br/>
+              <w:t>├── environments/                 # JSON dynamic token replacement files</w:t>
+              <w:br/>
+              <w:t>├── exports/                      # Holds SailPoint_GitOps_CICD_Architecture.docx</w:t>
               <w:br/>
               <w:t>└── scripts/</w:t>
               <w:br/>

</xml_diff>

<commit_message>
docs: Update README.md flowchart and sync updated Architecture docx
</commit_message>
<xml_diff>
--- a/exports/SailPoint_GitOps_CICD_Architecture.docx
+++ b/exports/SailPoint_GitOps_CICD_Architecture.docx
@@ -421,11 +421,6 @@
               <w:ind w:left="144" w:right="144"/>
             </w:pPr>
             <w:r>
-              <w:rPr>
-                <w:rFonts w:ascii="Consolas" w:hAnsi="Consolas"/>
-                <w:color w:val="333333"/>
-                <w:sz w:val="19"/>
-              </w:rPr>
               <w:t>SailPoint_ISC_CI-CD_SailPoint_CLI_AWS/</w:t>
               <w:br/>
               <w:t>├── .github/</w:t>
@@ -472,7 +467,7 @@
               <w:br/>
               <w:t>└── scripts/</w:t>
               <w:br/>
-              <w:t xml:space="preserve">    ├── deploy_cli.sh             # Compilation and SailPoint CLI import script</w:t>
+              <w:t xml:space="preserve">    ├── deploy.sh             # Compilation and SailPoint CLI import script</w:t>
               <w:br/>
               <w:t xml:space="preserve">    ├── deploy_local.ps1          # Developer offline testing PowerShell script</w:t>
               <w:br/>
@@ -858,10 +853,10 @@
       <w:r>
         <w:t>The SailPoint CLI is pinned to a specific version at the top of the workflow file using a variable:</w:t>
         <w:br/>
-        <w:t xml:space="preserve">  CLI_VERSION: '2.2.12'</w:t>
+        <w:t xml:space="preserve">  SAIL_SAIL_CLI_VERSION: '2.2.12'</w:t>
         <w:br/>
         <w:br/>
-        <w:t>During execution, the pipeline runs an automated update checker that queries the SailPoint GitHub releases API. If a newer version is available, it posts a yellow warning banner in your GitHub Actions interface. To upgrade, a developer simply edits the 'CLI_VERSION' variable in the workflow file to the new version number.</w:t>
+        <w:t>During execution, the pipeline runs an automated update checker that queries the SailPoint GitHub releases API. If a newer version is available, it posts a yellow warning banner in your GitHub Actions interface. To upgrade, a developer simply edits the 'SAIL_SAIL_CLI_VERSION' variable in the workflow file to the new version number.</w:t>
       </w:r>
     </w:p>
     <w:p>

</xml_diff>